<commit_message>
Atualização do sistema: correção de dependências e melhorias no .gitignore
</commit_message>
<xml_diff>
--- a/Teste_estacionamento_rotativo.docx
+++ b/Teste_estacionamento_rotativo.docx
@@ -74,13 +74,8 @@
       <w:pPr>
         <w:pStyle w:val="PargrafodaLista"/>
       </w:pPr>
-      <w:proofErr w:type="gramStart"/>
-      <w:r>
-        <w:t>Placa :</w:t>
-      </w:r>
-      <w:proofErr w:type="gramEnd"/>
-      <w:r>
-        <w:t xml:space="preserve"> </w:t>
+      <w:r>
+        <w:t xml:space="preserve">Placa : </w:t>
       </w:r>
       <w:r>
         <w:t>BEE4R22</w:t>
@@ -101,13 +96,8 @@
       <w:pPr>
         <w:pStyle w:val="PargrafodaLista"/>
       </w:pPr>
-      <w:proofErr w:type="gramStart"/>
-      <w:r>
-        <w:t>Modelo :</w:t>
-      </w:r>
-      <w:proofErr w:type="gramEnd"/>
-      <w:r>
-        <w:t xml:space="preserve"> Palio   </w:t>
+      <w:r>
+        <w:t xml:space="preserve">Modelo : Palio   </w:t>
       </w:r>
     </w:p>
     <w:p>
@@ -477,12 +467,10 @@
         <w:t xml:space="preserve"> </w:t>
       </w:r>
       <w:proofErr w:type="spellStart"/>
-      <w:proofErr w:type="gramStart"/>
       <w:r>
         <w:t>carlos</w:t>
       </w:r>
       <w:proofErr w:type="spellEnd"/>
-      <w:proofErr w:type="gramEnd"/>
       <w:r>
         <w:t xml:space="preserve"> Oliveira</w:t>
       </w:r>
@@ -636,15 +624,7 @@
       </w:r>
       <w:proofErr w:type="spellEnd"/>
       <w:r>
-        <w:t xml:space="preserve"> visual com </w:t>
-      </w:r>
-      <w:proofErr w:type="gramStart"/>
-      <w:r>
-        <w:t>HTML,CSS</w:t>
-      </w:r>
-      <w:proofErr w:type="gramEnd"/>
-      <w:r>
-        <w:t>, JAVASCRIPT</w:t>
+        <w:t xml:space="preserve"> visual com HTML,CSS, JAVASCRIPT</w:t>
       </w:r>
     </w:p>
     <w:p>
@@ -986,17 +966,12 @@
         <w:t xml:space="preserve"> envia os dados via </w:t>
       </w:r>
       <w:proofErr w:type="spellStart"/>
-      <w:proofErr w:type="gramStart"/>
       <w:r>
         <w:t>fetch</w:t>
       </w:r>
       <w:proofErr w:type="spellEnd"/>
       <w:r>
-        <w:t>(</w:t>
-      </w:r>
-      <w:proofErr w:type="gramEnd"/>
-      <w:r>
-        <w:t xml:space="preserve">) para o </w:t>
+        <w:t xml:space="preserve">() para o </w:t>
       </w:r>
       <w:proofErr w:type="spellStart"/>
       <w:r>
@@ -1469,17 +1444,12 @@
               <w:t xml:space="preserve">Comunicação via </w:t>
             </w:r>
             <w:proofErr w:type="spellStart"/>
-            <w:proofErr w:type="gramStart"/>
             <w:r>
               <w:t>fetch</w:t>
             </w:r>
             <w:proofErr w:type="spellEnd"/>
             <w:r>
-              <w:t>(</w:t>
-            </w:r>
-            <w:proofErr w:type="gramEnd"/>
-            <w:r>
-              <w:t>) (</w:t>
+              <w:t>() (</w:t>
             </w:r>
             <w:proofErr w:type="spellStart"/>
             <w:r>
@@ -1548,13 +1518,8 @@
               </w:rPr>
               <w:t>⚠</w:t>
             </w:r>
-            <w:proofErr w:type="gramStart"/>
             <w:r>
-              <w:t>️ Precisa</w:t>
-            </w:r>
-            <w:proofErr w:type="gramEnd"/>
-            <w:r>
-              <w:t xml:space="preserve"> melhorar</w:t>
+              <w:t>️ Precisa melhorar</w:t>
             </w:r>
           </w:p>
         </w:tc>
@@ -1700,15 +1665,7 @@
     </w:p>
     <w:p>
       <w:r>
-        <w:t xml:space="preserve">E retornar as informações do proprietário. COM </w:t>
-      </w:r>
-      <w:proofErr w:type="gramStart"/>
-      <w:r>
-        <w:t>“ CPF</w:t>
-      </w:r>
-      <w:proofErr w:type="gramEnd"/>
-      <w:r>
-        <w:t>, NOME,BLOCO,APARTAMENTO</w:t>
+        <w:t>E retornar as informações do proprietário. COM “ CPF, NOME,BLOCO,APARTAMENTO</w:t>
       </w:r>
       <w:r>
         <w:t xml:space="preserve"> </w:t>
@@ -1762,15 +1719,7 @@
     </w:p>
     <w:p>
       <w:r>
-        <w:t xml:space="preserve">E retornar as informações do proprietário. COM </w:t>
-      </w:r>
-      <w:proofErr w:type="gramStart"/>
-      <w:r>
-        <w:t>“ CPF</w:t>
-      </w:r>
-      <w:proofErr w:type="gramEnd"/>
-      <w:r>
-        <w:t xml:space="preserve">, NOME,BLOCO,APARTAMENTO </w:t>
+        <w:t xml:space="preserve">E retornar as informações do proprietário. COM “ CPF, NOME,BLOCO,APARTAMENTO </w:t>
       </w:r>
       <w:r>
         <w:t>e</w:t>
@@ -1905,15 +1854,7 @@
     </w:p>
     <w:p>
       <w:r>
-        <w:t xml:space="preserve">No “histórico dos Serviços por Matricula.” Mostrar todas as atividades de entrada, saída, verificação do status </w:t>
-      </w:r>
-      <w:proofErr w:type="gramStart"/>
-      <w:r>
-        <w:t>das vaga</w:t>
-      </w:r>
-      <w:proofErr w:type="gramEnd"/>
-      <w:r>
-        <w:t xml:space="preserve">. </w:t>
+        <w:t xml:space="preserve">No “histórico dos Serviços por Matricula.” Mostrar todas as atividades de entrada, saída, verificação do status das vaga. </w:t>
       </w:r>
     </w:p>
     <w:p>
@@ -1921,31 +1862,18 @@
         <w:t>Quando a área ‘</w:t>
       </w:r>
       <w:r>
-        <w:t xml:space="preserve">área do </w:t>
-      </w:r>
-      <w:proofErr w:type="gramStart"/>
-      <w:r>
-        <w:t xml:space="preserve">Supervisor </w:t>
+        <w:t xml:space="preserve">área do Supervisor </w:t>
       </w:r>
       <w:r>
         <w:t>’</w:t>
       </w:r>
-      <w:proofErr w:type="gramEnd"/>
       <w:r>
         <w:t xml:space="preserve"> login confirmado com sucesso!</w:t>
       </w:r>
     </w:p>
     <w:p>
       <w:r>
-        <w:t xml:space="preserve">Limpar a área de escrita e passar para </w:t>
-      </w:r>
-      <w:proofErr w:type="gramStart"/>
-      <w:r>
-        <w:t>o próxima</w:t>
-      </w:r>
-      <w:proofErr w:type="gramEnd"/>
-      <w:r>
-        <w:t xml:space="preserve"> </w:t>
+        <w:t xml:space="preserve">Limpar a área de escrita e passar para o próxima </w:t>
       </w:r>
       <w:proofErr w:type="spellStart"/>
       <w:r>
@@ -1958,15 +1886,7 @@
     </w:p>
     <w:p>
       <w:r>
-        <w:t xml:space="preserve">E </w:t>
-      </w:r>
-      <w:proofErr w:type="gramStart"/>
-      <w:r>
-        <w:t>retirar  ‘</w:t>
-      </w:r>
-      <w:proofErr w:type="gramEnd"/>
-      <w:r>
-        <w:t xml:space="preserve">Cadastrar Funcionário’ e ‘Funcionários Cadastrados’ desta </w:t>
+        <w:t xml:space="preserve">E retirar  ‘Cadastrar Funcionário’ e ‘Funcionários Cadastrados’ desta </w:t>
       </w:r>
       <w:proofErr w:type="spellStart"/>
       <w:r>
@@ -1989,13 +1909,8 @@
       </w:r>
     </w:p>
     <w:p>
-      <w:proofErr w:type="gramStart"/>
-      <w:r>
-        <w:t>ESTA</w:t>
-      </w:r>
-      <w:proofErr w:type="gramEnd"/>
-      <w:r>
-        <w:t xml:space="preserve"> ACABANDO!!!</w:t>
+      <w:r>
+        <w:t>ESTA ACABANDO!!!</w:t>
       </w:r>
     </w:p>
     <w:p>
@@ -2046,13 +1961,8 @@
       </w:r>
       <w:r>
         <w:br/>
-        <w:t>16/07/</w:t>
-      </w:r>
-      <w:proofErr w:type="gramStart"/>
-      <w:r>
-        <w:t>2025..</w:t>
-      </w:r>
-      <w:proofErr w:type="gramEnd"/>
+        <w:t>16/07/2025..</w:t>
+      </w:r>
     </w:p>
     <w:p>
       <w:r>
@@ -2133,20 +2043,34 @@
         <w:rPr>
           <w:lang w:val="en-GB"/>
         </w:rPr>
-        <w:t xml:space="preserve"> Java </w:t>
-      </w:r>
-      <w:proofErr w:type="gramStart"/>
+        <w:t xml:space="preserve"> Java script , </w:t>
+      </w:r>
+      <w:proofErr w:type="spellStart"/>
       <w:r>
         <w:rPr>
           <w:lang w:val="en-GB"/>
         </w:rPr>
-        <w:t>script ,</w:t>
-      </w:r>
-      <w:proofErr w:type="gramEnd"/>
+        <w:t>css</w:t>
+      </w:r>
+      <w:proofErr w:type="spellEnd"/>
       <w:r>
         <w:rPr>
           <w:lang w:val="en-GB"/>
         </w:rPr>
+        <w:t xml:space="preserve">, html, e </w:t>
+      </w:r>
+      <w:proofErr w:type="spellStart"/>
+      <w:r>
+        <w:rPr>
+          <w:lang w:val="en-GB"/>
+        </w:rPr>
+        <w:t>linguagens</w:t>
+      </w:r>
+      <w:proofErr w:type="spellEnd"/>
+      <w:r>
+        <w:rPr>
+          <w:lang w:val="en-GB"/>
+        </w:rPr>
         <w:t xml:space="preserve"> </w:t>
       </w:r>
       <w:proofErr w:type="spellStart"/>
@@ -2154,65 +2078,80 @@
         <w:rPr>
           <w:lang w:val="en-GB"/>
         </w:rPr>
-        <w:t>css</w:t>
+        <w:t>sugeridas</w:t>
       </w:r>
       <w:proofErr w:type="spellEnd"/>
       <w:r>
         <w:rPr>
           <w:lang w:val="en-GB"/>
         </w:rPr>
-        <w:t xml:space="preserve">, html, e </w:t>
+        <w:t>”</w:t>
+      </w:r>
+    </w:p>
+    <w:p>
+      <w:r>
+        <w:t>Criar uma área de gestão.</w:t>
+      </w:r>
+    </w:p>
+    <w:p>
+      <w:r>
+        <w:t>Função do supervisor!</w:t>
+      </w:r>
+    </w:p>
+    <w:p>
+      <w:r>
+        <w:t xml:space="preserve">Cadastrar funcionários, com </w:t>
+      </w:r>
+    </w:p>
+    <w:p/>
+    <w:p>
+      <w:r>
+        <w:t>Histórico de ação funcionários</w:t>
+      </w:r>
+    </w:p>
+    <w:p/>
+    <w:p/>
+    <w:p/>
+    <w:p>
+      <w:r>
+        <w:t>Teste do projeto</w:t>
+      </w:r>
+      <w:r>
+        <w:br/>
       </w:r>
       <w:proofErr w:type="spellStart"/>
       <w:r>
-        <w:rPr>
-          <w:lang w:val="en-GB"/>
-        </w:rPr>
-        <w:t>linguagens</w:t>
+        <w:t>Repositorio</w:t>
       </w:r>
       <w:proofErr w:type="spellEnd"/>
       <w:r>
-        <w:rPr>
-          <w:lang w:val="en-GB"/>
-        </w:rPr>
-        <w:t xml:space="preserve"> </w:t>
+        <w:t xml:space="preserve"> do </w:t>
       </w:r>
       <w:proofErr w:type="spellStart"/>
       <w:r>
-        <w:rPr>
-          <w:lang w:val="en-GB"/>
-        </w:rPr>
-        <w:t>sugeridas</w:t>
+        <w:t>Github</w:t>
       </w:r>
       <w:proofErr w:type="spellEnd"/>
-      <w:r>
-        <w:rPr>
-          <w:lang w:val="en-GB"/>
-        </w:rPr>
-        <w:t>”</w:t>
-      </w:r>
-    </w:p>
-    <w:p>
-      <w:r>
-        <w:t>Criar uma área de gestão.</w:t>
-      </w:r>
-    </w:p>
-    <w:p>
-      <w:r>
-        <w:t>Função do supervisor!</w:t>
-      </w:r>
-    </w:p>
-    <w:p>
-      <w:r>
-        <w:t xml:space="preserve">Cadastrar funcionários, com </w:t>
-      </w:r>
+    </w:p>
+    <w:p>
+      <w:pPr>
+        <w:rPr>
+          <w:b/>
+          <w:bCs/>
+        </w:rPr>
+      </w:pPr>
+      <w:hyperlink r:id="rId8" w:history="1">
+        <w:r>
+          <w:rPr>
+            <w:rStyle w:val="Hyperlink"/>
+            <w:b/>
+            <w:bCs/>
+          </w:rPr>
+          <w:t>https://github.com/andjpython/Teste_estacionamento.git</w:t>
+        </w:r>
+      </w:hyperlink>
     </w:p>
     <w:p/>
-    <w:p>
-      <w:r>
-        <w:t>Histórico de ação funcionários</w:t>
-      </w:r>
-    </w:p>
     <w:p/>
     <w:p/>
     <w:sectPr>
@@ -3647,7 +3586,6 @@
   <w:style w:type="character" w:default="1" w:styleId="Fontepargpadro">
     <w:name w:val="Default Paragraph Font"/>
     <w:uiPriority w:val="1"/>
-    <w:semiHidden/>
     <w:unhideWhenUsed/>
   </w:style>
   <w:style w:type="table" w:default="1" w:styleId="Tabelanormal">
@@ -3957,6 +3895,29 @@
       <w:smallCaps/>
       <w:color w:val="0F4761" w:themeColor="accent1" w:themeShade="BF"/>
       <w:spacing w:val="5"/>
+    </w:rPr>
+  </w:style>
+  <w:style w:type="character" w:styleId="Hyperlink">
+    <w:name w:val="Hyperlink"/>
+    <w:basedOn w:val="Fontepargpadro"/>
+    <w:uiPriority w:val="99"/>
+    <w:unhideWhenUsed/>
+    <w:rsid w:val="00E21129"/>
+    <w:rPr>
+      <w:color w:val="467886" w:themeColor="hyperlink"/>
+      <w:u w:val="single"/>
+    </w:rPr>
+  </w:style>
+  <w:style w:type="character" w:styleId="MenoPendente">
+    <w:name w:val="Unresolved Mention"/>
+    <w:basedOn w:val="Fontepargpadro"/>
+    <w:uiPriority w:val="99"/>
+    <w:semiHidden/>
+    <w:unhideWhenUsed/>
+    <w:rsid w:val="00E21129"/>
+    <w:rPr>
+      <w:color w:val="605E5C"/>
+      <w:shd w:val="clear" w:color="auto" w:fill="E1DFDD"/>
     </w:rPr>
   </w:style>
 </w:styles>

</xml_diff>